<commit_message>
feat(docs): redesign System Flow into clean 4-tier pipeline architecture with zero clutter
</commit_message>
<xml_diff>
--- a/NSS_Lab_System_Flow_Architecture.docx
+++ b/NSS_Lab_System_Flow_Architecture.docx
@@ -55,7 +55,7 @@
       <w:r>
         <w:drawing>
           <wp:inline xmlns:a="http://schemas.openxmlformats.org/drawingml/2006/main" xmlns:pic="http://schemas.openxmlformats.org/drawingml/2006/picture">
-            <wp:extent cx="6217920" cy="4117151"/>
+            <wp:extent cx="6217920" cy="5127223"/>
             <wp:docPr id="1" name="Picture 1"/>
             <wp:cNvGraphicFramePr>
               <a:graphicFrameLocks noChangeAspect="1"/>
@@ -76,7 +76,7 @@
                   <pic:spPr>
                     <a:xfrm>
                       <a:off x="0" y="0"/>
-                      <a:ext cx="6217920" cy="4117151"/>
+                      <a:ext cx="6217920" cy="5127223"/>
                     </a:xfrm>
                     <a:prstGeom prst="rect"/>
                   </pic:spPr>

</xml_diff>